<commit_message>
Whitepaper: texto reescrito em português técnico brasileiro, rótulos das figuras e da tabela alinhados
Registro calibrado no artigo de Bressan et al. (2011): verbos impessoais, terminologia do setor (instituições captadoras de depósitos, provisão para créditos de liquidação duvidosa, operações de crédito, enquadramento, sistemas cooperativos), retorno sobre o ativo, índice de eficiência. Tabela sem a coluna de retenção; cabeçalhos curtos.

Co-Authored-By: Claude Fable 5.1 <noreply@anthropic.com>
</commit_message>
<xml_diff>
--- a/paper/Whitepaper_SistemaOCB_Cooperativas_e_Bancos_Basileia.docx
+++ b/paper/Whitepaper_SistemaOCB_Cooperativas_e_Bancos_Basileia.docx
@@ -35,7 +35,7 @@
           <w:sz w:val="20"/>
           <w:szCs w:val="20"/>
         </w:rPr>
-        <w:t xml:space="preserve">O que os dados do Banco Central mostram sobre o perfil das cooperativas que operam na metodologia completa de Basileia, 2017 a 2024</w:t>
+        <w:t xml:space="preserve">O que os dados do Banco Central revelam sobre o perfil das cooperativas enquadradas na metodologia completa de Basileia, 2017 a 2024</w:t>
       </w:r>
     </w:p>
     <w:p>
@@ -100,7 +100,7 @@
         <w:jc w:val="both"/>
       </w:pPr>
       <w:r>
-        <w:t xml:space="preserve">Desde 2017, a cooperativa de crédito que cresce além de 0,1% do PIB em exposição, ou que abre mão do regime simplificado, calcula capital, risco e provisão pelas mesmas regras que um banco comercial.</w:t>
+        <w:t xml:space="preserve">Desde 2017, a cooperativa de crédito cujo porte supera 0,1% do PIB, ou que opta por deixar o regime simplificado, apura capital, riscos e provisões pelas mesmas regras aplicadas a um banco comercial.</w:t>
       </w:r>
     </w:p>
     <w:p>
@@ -114,7 +114,7 @@
         <w:jc w:val="both"/>
       </w:pPr>
       <w:r>
-        <w:t xml:space="preserve">Este estudo compara 130 cooperativas singulares e 144 bancos nessa condição, com dados públicos do IF.data, de 2017 a 2024, em porte comparável.</w:t>
+        <w:t xml:space="preserve">Este estudo compara 130 cooperativas singulares e 144 bancos nessa situação, com dados públicos do IF.data de 2017 a 2024, controlando o porte das instituições.</w:t>
       </w:r>
     </w:p>
     <w:p>
@@ -128,7 +128,7 @@
         <w:jc w:val="both"/>
       </w:pPr>
       <w:r>
-        <w:t xml:space="preserve">A cooperativa destina parcela maior do ativo ao crédito, tem retorno sobre ativos mais alto, custo menor e retorno menos volátil que o banco de porte semelhante.</w:t>
+        <w:t xml:space="preserve">Em relação a bancos de porte semelhante, as cooperativas destinam parcela maior do ativo ao crédito, obtêm retorno sobre o ativo mais alto, operam com custo menor e apresentam retornos mais estáveis.</w:t>
       </w:r>
     </w:p>
     <w:p>
@@ -142,7 +142,7 @@
         <w:jc w:val="both"/>
       </w:pPr>
       <w:r>
-        <w:t xml:space="preserve">A diferença de capital é moderada em nível e grande em dispersão: as cooperativas ocupam uma faixa estreita do índice de Basileia, sem a cauda de bancos pequenos com índices acima de 50%.</w:t>
+        <w:t xml:space="preserve">A diferença de capital é moderada em nível e grande em dispersão: as cooperativas se concentram em uma faixa estreita do índice de Basileia e não apresentam a cauda de bancos pequenos com índices acima de 50%.</w:t>
       </w:r>
     </w:p>
     <w:p>
@@ -156,7 +156,7 @@
         <w:jc w:val="both"/>
       </w:pPr>
       <w:r>
-        <w:t xml:space="preserve">Duas diferenças citadas com frequência, provisão menor e margem mais estreita, desaparecem quando a comparação se restringe a bancos.</w:t>
+        <w:t xml:space="preserve">Duas diferenças citadas com frequência, o menor provisionamento e a margem mais estreita, desaparecem quando a comparação se restringe aos bancos.</w:t>
       </w:r>
     </w:p>
     <w:p>
@@ -170,7 +170,7 @@
         <w:jc w:val="both"/>
       </w:pPr>
       <w:r>
-        <w:t xml:space="preserve">Para a regulação proporcional, os resultados abrem dois eixos além do porte: o tratamento das redes cooperativas e a calibragem do benchmark. Alívio regulatório não decorre automaticamente desses achados.</w:t>
+        <w:t xml:space="preserve">Para a regulação proporcional, os resultados indicam duas dimensões além do porte: o tratamento dos sistemas cooperativos e a calibragem do referencial prudencial. Um alívio regulatório não decorre automaticamente desses resultados.</w:t>
       </w:r>
     </w:p>
     <w:p>
@@ -211,7 +211,7 @@
           <w:sz w:val="24"/>
           <w:szCs w:val="24"/>
         </w:rPr>
-        <w:t xml:space="preserve">1.1 Uma régua comum</w:t>
+        <w:t xml:space="preserve">1.1 Um mesmo conjunto de regras</w:t>
       </w:r>
     </w:p>
     <w:p>
@@ -221,7 +221,7 @@
         <w:jc w:val="both"/>
       </w:pPr>
       <w:r>
-        <w:t xml:space="preserve">A regulação prudencial convergiu para um modelo único. Basileia III fornece a arquitetura de capital, alavancagem e mensuração de risco, e cada supervisor a adapta às condições locais. No Brasil, a Resolução CMN 4.553/2017 distribui as instituições autorizadas em cinco segmentos, segundo o porte e a atividade internacional. Os segmentos S1 a S4 aplicam a metodologia completa. O S5 reúne instituições com exposição inferior a 0,1% do PIB que optam pela metodologia simplificada de apuração do capital mínimo (Resolução 4.606/2017). Bancos comerciais, múltiplos, de investimento e de câmbio ficam fora do S5 em qualquer porte.</w:t>
+        <w:t xml:space="preserve">A regulação prudencial convergiu para um modelo único. O acordo de Basileia III define a estrutura de capital, de alavancagem e de mensuração de riscos, e cada supervisor nacional a adapta às condições locais. No Brasil, a Resolução CMN 4.553/2017 enquadra as instituições autorizadas a funcionar em cinco segmentos, conforme o porte e a relevância da atividade internacional. Os segmentos S1 a S4 aplicam a metodologia completa. O S5 é composto pelas instituições de porte inferior a 0,1% do PIB que optam pela metodologia facultativa simplificada de apuração dos requerimentos mínimos de capital (Resolução CMN 4.606/2017). Bancos comerciais, múltiplos, de investimento e de câmbio não podem integrar o S5, qualquer que seja o porte.</w:t>
       </w:r>
     </w:p>
     <w:p>
@@ -231,7 +231,7 @@
         <w:jc w:val="both"/>
       </w:pPr>
       <w:r>
-        <w:t xml:space="preserve">A consequência para o cooperativismo é direta. A cooperativa que ultrapassa o limiar, ou que deixa de usar a metodologia simplificada, passa a calcular capital com a mesma definição, os mesmos requerimentos mínimos, os mesmos ponderadores de risco e as mesmas regras de provisão de um banco comercial. As regras de capital são as das Resoluções 4.192 e 4.193/2013, substituídas em janeiro de 2022 pelas Resoluções 4.955 e 4.958, e a Resolução 2.682/1999 rege a classificação e o provisionamento das operações. Poucos requisitos variam por segmento: os índices de liquidez e o adicional sistêmico valem apenas para o S1, e a razão de alavancagem para S1 e S2. Esses dois segmentos contêm apenas bancos.</w:t>
+        <w:t xml:space="preserve">Para o cooperativismo de crédito, a consequência é direta. A cooperativa que ultrapassa esse limite, ou que deixa de adotar a metodologia simplificada, passa a apurar seu capital regulamentar como um banco comercial. Valem para ela a mesma definição de Patrimônio de Referência, os mesmos requerimentos mínimos, os mesmos fatores de ponderação de risco e as mesmas regras de provisionamento. As regras de capital são as das Resoluções CMN 4.192 e 4.193/2013, substituídas em janeiro de 2022 pelas Resoluções 4.955 e 4.958, e a classificação e o provisionamento das operações de crédito seguem a Resolução CMN 2.682/1999. Poucas exigências variam entre os segmentos: os índices de liquidez e o adicional de importância sistêmica aplicam-se apenas ao S1, e a razão de alavancagem, ao S1 e ao S2. Esses dois segmentos são formados exclusivamente por bancos.</w:t>
       </w:r>
     </w:p>
     <w:p>
@@ -315,7 +315,7 @@
           <w:sz w:val="16"/>
           <w:szCs w:val="16"/>
         </w:rPr>
-        <w:t xml:space="preserve">Fonte: elaboração dos autores com dados do IF.data (Banco Central do Brasil). O painel (c) mostra a parcela de instituições na metodologia completa. O degrau de 2023 no painel (b) é a entrada dos conglomerados de instituições de pagamento.</w:t>
+        <w:t xml:space="preserve">Fonte: elaboração dos autores com dados do IF.data (Banco Central do Brasil). O painel (c) mostra a parcela de instituições enquadradas na metodologia completa. O degrau de 2023 no painel (b) corresponde à entrada dos conglomerados liderados por instituições de pagamento.</w:t>
       </w:r>
     </w:p>
     <w:p>
@@ -335,7 +335,7 @@
           <w:sz w:val="24"/>
           <w:szCs w:val="24"/>
         </w:rPr>
-        <w:t xml:space="preserve">1.2 O cooperativismo de crédito no sistema financeiro</w:t>
+        <w:t xml:space="preserve">1.2 O cooperativismo de crédito no Sistema Financeiro Nacional</w:t>
       </w:r>
     </w:p>
     <w:p>
@@ -345,7 +345,7 @@
         <w:jc w:val="both"/>
       </w:pPr>
       <w:r>
-        <w:t xml:space="preserve">As cooperativas de crédito são instituições captadoras de depósitos, de propriedade dos associados, que emprestam sobretudo a eles. Organizam-se sob a Lei Complementar 130/2009 e, desde janeiro de 2023, sob a Resolução CMN 5.051/2022, que as classifica em plenas, clássicas e de capital e empréstimo. O segmento detinha cerca de 6% dos ativos do sistema financeiro ao fim de 2024 e 6,3% um ano depois, com participação crescente em todos os anos desde 2020. Boa parte do setor pertence a sistemas integrados, nos quais as centrais fornecem liquidez, gestão consolidada de risco e uma interface única com a supervisão.</w:t>
+        <w:t xml:space="preserve">As cooperativas de crédito são instituições financeiras captadoras de depósitos, de propriedade de seus associados, cuja carteira de crédito se destina majoritariamente a eles. São regidas pela Lei Complementar 130/2009 e, desde janeiro de 2023, pela Resolução CMN 5.051/2022, que as classifica em plenas, clássicas e de capital e empréstimo. O segmento respondia por cerca de 6% dos ativos do Sistema Financeiro Nacional ao final de 2024 e por 6,3% em dezembro de 2025, com participação crescente em todos os anos desde 2020. A maior parte das singulares é filiada a sistemas cooperativos, nos quais as centrais oferecem centralização financeira, gestão consolidada de riscos e um canal único de relacionamento com a supervisão.</w:t>
       </w:r>
     </w:p>
     <w:p>
@@ -375,7 +375,7 @@
         <w:jc w:val="both"/>
       </w:pPr>
       <w:r>
-        <w:t xml:space="preserve">O benchmark prudencial é calibrado na instituição média sob a metodologia completa. Se essa média descreve uma instituição que pouco empresta, a cooperativa que atende a economia local é medida com uma régua feita para outro tipo de negócio. A teoria dá razões para esperar um perfil distinto. O capital da cooperativa é um dote de reservas acumuladas ao longo de gerações de associados, que não pode ser complementado com capital de terceiros com direito a voto. A cota-parte do associado é um direito de uso da instituição, com incentivos limitados para acumular capital além do que o atendimento aos membros exige.</w:t>
+        <w:t xml:space="preserve">O referencial prudencial é calibrado pela instituição média enquadrada na metodologia completa. Se essa média descreve uma instituição que pouco empresta, a cooperativa que atende à economia local é avaliada por um padrão construído para outro tipo de negócio. A teoria econômica das cooperativas oferece razões para esperar um perfil distinto. O capital da cooperativa é formado por reservas acumuladas ao longo de gerações de associados, um patrimônio sem dono final, que não pode ser reforçado com aportes de investidores externos com direito a voto. A cota-parte do associado é um direito de uso dos serviços da instituição, e os incentivos para acumular capital além do necessário ao atendimento dos cooperados são limitados.</w:t>
       </w:r>
     </w:p>
     <w:p>
@@ -385,7 +385,7 @@
         <w:jc w:val="both"/>
       </w:pPr>
       <w:r>
-        <w:t xml:space="preserve">As pesquisas internacionais sobre proporcionalidade registram porte, complexidade e modelo de negócio como critérios em uso, e nenhum baseado na forma organizacional. Onde o supervisor adapta o arcabouço às cooperativas, a adaptação recai sobre o tratamento das cotas como capital e sobre os arranjos das redes. A literatura empírica encontra bancos cooperativos mais estáveis, menos lucrativos e menos capitalizados que bancos comerciais, mas nenhum estudo compara as duas formas sob uma metodologia prudencial comum. O Brasil oferece esse experimento natural.</w:t>
+        <w:t xml:space="preserve">Os levantamentos internacionais sobre proporcionalidade apontam porte, complexidade e modelo de negócios como os critérios adotados pelos supervisores; nenhum deles considera a forma organizacional. Onde o supervisor adapta o arcabouço às cooperativas, a adaptação recai sobre o tratamento das cotas-partes como capital e sobre os arranjos dos sistemas. A literatura empírica internacional indica que os bancos cooperativos são mais estáveis, menos rentáveis e menos capitalizados que os bancos comerciais. Nenhum desses estudos, porém, compara as duas formas de organização sob uma metodologia prudencial comum. O Brasil oferece esse experimento natural.</w:t>
       </w:r>
     </w:p>
     <w:p>
@@ -436,7 +436,7 @@
         <w:jc w:val="both"/>
       </w:pPr>
       <w:r>
-        <w:t xml:space="preserve">A base é o IF.data, repositório estatístico público do Banco Central. Os relatórios de resumo financeiro, segmentação, composição de ativos e demonstração de resultado foram unidos por instituição e data-base, de 2014 a 2024. As instituições são classificadas pelo tipo de consolidado bancário do próprio regulador, e não pelo nome: o código b3S identifica a cooperativa singular e o b3C a central. As centrais ficam fora da análise, por serem entidades de atacado com capital elevado por razões estruturais. A classificação por nome colocaria os bancos cooperativos Sicredi e Sicoob, ambos bancos comerciais, no grupo das cooperativas.</w:t>
+        <w:t xml:space="preserve">Os dados provêm do IF.data, base pública de informações das instituições financeiras divulgada pelo Banco Central do Brasil. Os relatórios de resumo, de segmentação, de composição do ativo e de demonstração de resultado foram combinados por instituição e data-base, de 2014 a 2024. A classificação das instituições segue o tipo de consolidado bancário definido pelo próprio regulador: o código b3S identifica as cooperativas singulares e o b3C, as centrais e confederações. As centrais foram excluídas da análise, por serem entidades de segundo grau, que prestam serviços de centralização financeira e de gestão de riscos às filiadas e mantêm capital elevado por razões estruturais. Uma classificação pelo nome colocaria o Banco Cooperativo Sicredi e o Banco Sicoob, ambos bancos comerciais, no grupo das cooperativas.</w:t>
       </w:r>
     </w:p>
     <w:p>
@@ -446,7 +446,7 @@
         <w:jc w:val="both"/>
       </w:pPr>
       <w:r>
-        <w:t xml:space="preserve">A amostra reúne todas as instituições na metodologia completa entre o primeiro trimestre de 2017 e o último de 2024: 130 cooperativas singulares e 144 bancos, em 7.234 observações de instituição-trimestre. O grupo de comparação principal são os bancos comerciais e múltiplos com carteira comercial e os bancos múltiplos e de investimento. Outros quatro grupos são usados como parâmetro: todas as não cooperativas, bancos da mesma macrorregião, apenas bancos comerciais e bancos com depósitos em todos os trimestres.</w:t>
+        <w:t xml:space="preserve">A amostra abrange todas as instituições enquadradas na metodologia completa entre o primeiro trimestre de 2017 e o quarto trimestre de 2024: 130 cooperativas singulares e 144 bancos, em 7.234 observações trimestrais. O grupo de comparação principal reúne os bancos comerciais, os bancos múltiplos com carteira comercial e os bancos múltiplos sem carteira comercial e de investimento. Outros quatro grupos servem de contraponto: todas as instituições não cooperativas, os bancos da mesma macrorregião, apenas os bancos comerciais e os bancos que captaram depósitos em todos os trimestres do período.</w:t>
       </w:r>
     </w:p>
     <w:p>
@@ -494,7 +494,7 @@
         <w:jc w:val="both"/>
       </w:pPr>
       <w:r>
-        <w:t xml:space="preserve">Alavancagem: passivo total sobre ativo total.</w:t>
+        <w:t xml:space="preserve">Alavancagem: razão entre o passivo total e o ativo total.</w:t>
       </w:r>
     </w:p>
     <w:p>
@@ -508,7 +508,7 @@
         <w:jc w:val="both"/>
       </w:pPr>
       <w:r>
-        <w:t xml:space="preserve">Retorno sobre ativos, anualizado.</w:t>
+        <w:t xml:space="preserve">Retorno sobre o ativo (ROA), anualizado.</w:t>
       </w:r>
     </w:p>
     <w:p>
@@ -522,7 +522,7 @@
         <w:jc w:val="both"/>
       </w:pPr>
       <w:r>
-        <w:t xml:space="preserve">Margem de intermediação sobre o ativo, bruta de provisão.</w:t>
+        <w:t xml:space="preserve">Margem de intermediação financeira sobre o ativo, antes das despesas de provisão.</w:t>
       </w:r>
     </w:p>
     <w:p>
@@ -536,7 +536,7 @@
         <w:jc w:val="both"/>
       </w:pPr>
       <w:r>
-        <w:t xml:space="preserve">Índice custo/receita.</w:t>
+        <w:t xml:space="preserve">Índice de eficiência: despesas de pessoal e administrativas sobre as receitas.</w:t>
       </w:r>
     </w:p>
     <w:p>
@@ -550,7 +550,7 @@
         <w:jc w:val="both"/>
       </w:pPr>
       <w:r>
-        <w:t xml:space="preserve">Carteira de crédito sobre o ativo total.</w:t>
+        <w:t xml:space="preserve">Operações de crédito sobre o ativo total.</w:t>
       </w:r>
     </w:p>
     <w:p>
@@ -564,7 +564,7 @@
         <w:jc w:val="both"/>
       </w:pPr>
       <w:r>
-        <w:t xml:space="preserve">Provisão constituída sobre a carteira bruta.</w:t>
+        <w:t xml:space="preserve">Provisão para créditos de liquidação duvidosa sobre a carteira de crédito.</w:t>
       </w:r>
     </w:p>
     <w:p>
@@ -578,7 +578,7 @@
         <w:jc w:val="both"/>
       </w:pPr>
       <w:r>
-        <w:t xml:space="preserve">Captações sobre o ativo total.</w:t>
+        <w:t xml:space="preserve">Captações de recursos sobre o ativo total.</w:t>
       </w:r>
     </w:p>
     <w:p>
@@ -592,7 +592,7 @@
         <w:jc w:val="both"/>
       </w:pPr>
       <w:r>
-        <w:t xml:space="preserve">Volatilidade do retorno sobre ativos e z-score, medidos por instituição.</w:t>
+        <w:t xml:space="preserve">Volatilidade do ROA e z-score, calculados por instituição ao longo do período.</w:t>
       </w:r>
     </w:p>
     <w:p>
@@ -622,7 +622,7 @@
         <w:jc w:val="both"/>
       </w:pPr>
       <w:r>
-        <w:t xml:space="preserve">Cada indicador é relacionado a uma variável que identifica a cooperativa, em quatro especificações de rigor crescente: diferença simples de médias; controle por porte (ativo total em logaritmo) e trimestre; pareamento exato com coarsening por quintil de porte, com controle por região; e restrição à faixa de porte em que os dois grupos coexistem. Os erros-padrão são agrupados por instituição e confirmados por um bootstrap apropriado a poucos grupos tratados. Como vários indicadores são assimétricos, a mediana condicional e as regressões quantílicas acompanham a média.</w:t>
+        <w:t xml:space="preserve">Para cada indicador, estima-se a diferença entre cooperativas e bancos em quatro especificações de rigor crescente: a diferença simples de médias; o controle por porte (logaritmo do ativo total) e por trimestre; o pareamento exato por faixas de porte, com controle por região; e a restrição à faixa de porte em que os dois grupos se sobrepõem. Os erros-padrão são agrupados por instituição, e a significância é confirmada por um procedimento de bootstrap adequado a amostras com poucos grupos tratados. Como a distribuição de vários indicadores é assimétrica, a mediana condicional e as regressões quantílicas são apresentadas ao lado da média.</w:t>
       </w:r>
     </w:p>
     <w:p>
@@ -632,7 +632,7 @@
         <w:jc w:val="both"/>
       </w:pPr>
       <w:r>
-        <w:t xml:space="preserve">Duas características do IF.data foram corrigidas. As contas de resultado acumulam dentro do semestre e foram desacumuladas e anualizadas. O resultado de intermediação é informado líquido da provisão para créditos de difícil liquidação e foi recomposto bruto dela, para que a margem e o índice de eficiência não repitam o resultado de provisão sob outro nome.</w:t>
+        <w:t xml:space="preserve">Dois ajustes foram feitos nos dados do IF.data. As contas de resultado são acumuladas dentro do semestre, porque as instituições levantam balanço em junho e dezembro; os valores foram desacumulados e anualizados. O resultado de intermediação financeira é informado líquido das despesas de provisão para créditos de liquidação duvidosa e foi recomposto antes dessas despesas, para que a margem e o índice de eficiência não reproduzam o resultado de provisão sob outra denominação.</w:t>
       </w:r>
     </w:p>
     <w:p>
@@ -642,7 +642,7 @@
         <w:jc w:val="both"/>
       </w:pPr>
       <w:r>
-        <w:t xml:space="preserve">Uma regra explícita classifica cada indicador. O resultado é nulo se não for significativo, com o mesmo sinal, nas quatro especificações. É estável se resistir a todas as regras de winsorização, variar menos que o dobro entre elas e manter, entre o 20º e o 80º percentil, pelo menos metade da magnitude da média. Do contrário, é estável no sinal: a direção se mantém, mas a magnitude depende das caudas.</w:t>
+        <w:t xml:space="preserve">Cada indicador recebe uma classificação segundo regra explícita. O resultado é considerado nulo quando a diferença não é significativa, com o mesmo sinal, nas quatro especificações. É considerado estável quando se mantém significativo sob todas as regras de tratamento de valores extremos, varia menos que o dobro entre elas e conserva, entre o 20º e o 80º percentil, ao menos metade da magnitude estimada na média. Nos demais casos, é estável apenas no sinal: a direção da diferença se mantém, mas a magnitude depende das caudas da distribuição.</w:t>
       </w:r>
     </w:p>
     <w:p>
@@ -693,7 +693,7 @@
         <w:jc w:val="both"/>
       </w:pPr>
       <w:r>
-        <w:t xml:space="preserve">Cinco dos oito indicadores trimestrais mantêm sinal e significância nas quatro especificações e em todas as regras de winsorização. Em porte comparável, a cooperativa destina cerca de um quinto a mais do ativo ao crédito, com diferença ainda maior na mediana. Seu retorno sobre ativos supera o do banco em cerca de dois pontos percentuais, uma diferença grande pelos padrões da literatura bancária. A margem de intermediação é indistinguível da margem bancária, de modo que o retorno maior vem do volume de crédito e do custo menor. A cooperativa opera com custo menor, embora a magnitude dessa diferença dependa das caudas, porque o denominador se aproxima de zero em bancos que pouco intermediam; a mediana condicional, cujo intervalo exclui zero, é a medida mais confiável.</w:t>
+        <w:t xml:space="preserve">Cinco dos oito indicadores trimestrais mantêm sinal e significância nas quatro especificações e em todas as regras de tratamento de valores extremos. Em porte comparável, as cooperativas destinam às operações de crédito uma parcela do ativo cerca de um quinto maior que a dos bancos, e a diferença é ainda maior na mediana. O retorno sobre o ativo supera o dos bancos em cerca de dois pontos percentuais, diferença expressiva para os padrões da literatura bancária. A margem de intermediação não difere da dos bancos, de modo que o retorno maior decorre do volume de crédito e do menor custo operacional. As cooperativas operam com custo menor, embora a magnitude dessa diferença dependa dos valores extremos, já que o denominador do índice se aproxima de zero em bancos com pouca intermediação. A mediana condicional, cujo intervalo de confiança exclui zero, é a medida mais confiável.</w:t>
       </w:r>
     </w:p>
     <w:p>
@@ -703,7 +703,7 @@
         <w:jc w:val="both"/>
       </w:pPr>
       <w:r>
-        <w:t xml:space="preserve">Os retornos da cooperativa também são menos voláteis. Em porte comparável, o desvio-padrão do retorno sobre ativos é menor e o z-score é maior, nas quatro especificações e em todos os grupos nacionais de comparação. A combinação é de retorno mais alto e mais estável, sobre a mesma margem de intermediação.</w:t>
+        <w:t xml:space="preserve">Os retornos das cooperativas também oscilam menos. Em porte comparável, o desvio-padrão do ROA é menor e o z-score é maior, nas quatro especificações e em todos os grupos nacionais de comparação. O quadro é de retorno mais alto e mais estável, obtido sobre a mesma margem de intermediação.</w:t>
       </w:r>
     </w:p>
     <w:p>
@@ -728,7 +728,7 @@
           <w:sz w:val="18"/>
           <w:szCs w:val="18"/>
         </w:rPr>
-        <w:t xml:space="preserve">Diferença cooperativa menos bancos, quatro especificações</w:t>
+        <w:t xml:space="preserve">Diferença entre cooperativas e bancos em quatro especificações</w:t>
       </w:r>
     </w:p>
     <w:tbl>
@@ -809,7 +809,7 @@
                 <w:sz w:val="16"/>
                 <w:szCs w:val="16"/>
               </w:rPr>
-              <w:t xml:space="preserve">(1) Bruta</w:t>
+              <w:t xml:space="preserve">(1) Sem controles</w:t>
             </w:r>
           </w:p>
         </w:tc>
@@ -834,7 +834,7 @@
                 <w:sz w:val="16"/>
                 <w:szCs w:val="16"/>
               </w:rPr>
-              <w:t xml:space="preserve">(2) Controles</w:t>
+              <w:t xml:space="preserve">(2) Porte e trimestre</w:t>
             </w:r>
           </w:p>
         </w:tc>
@@ -859,7 +859,7 @@
                 <w:sz w:val="16"/>
                 <w:szCs w:val="16"/>
               </w:rPr>
-              <w:t xml:space="preserve">(3) Pareada</w:t>
+              <w:t xml:space="preserve">(3) Pareado</w:t>
             </w:r>
           </w:p>
         </w:tc>
@@ -1343,7 +1343,7 @@
                 <w:sz w:val="16"/>
                 <w:szCs w:val="16"/>
               </w:rPr>
-              <w:t xml:space="preserve">Retorno sobre ativos</w:t>
+              <w:t xml:space="preserve">Retorno sobre o ativo</w:t>
             </w:r>
           </w:p>
         </w:tc>
@@ -1534,7 +1534,7 @@
                 <w:sz w:val="16"/>
                 <w:szCs w:val="16"/>
               </w:rPr>
-              <w:t xml:space="preserve">Custo / receita</w:t>
+              <w:t xml:space="preserve">Índice de eficiência</w:t>
             </w:r>
           </w:p>
         </w:tc>
@@ -1725,7 +1725,7 @@
                 <w:sz w:val="16"/>
                 <w:szCs w:val="16"/>
               </w:rPr>
-              <w:t xml:space="preserve">Crédito / ativos</w:t>
+              <w:t xml:space="preserve">Operações de crédito / ativo</w:t>
             </w:r>
           </w:p>
         </w:tc>
@@ -1916,7 +1916,7 @@
                 <w:sz w:val="16"/>
                 <w:szCs w:val="16"/>
               </w:rPr>
-              <w:t xml:space="preserve">Provisão / crédito</w:t>
+              <w:t xml:space="preserve">Provisão / carteira</w:t>
             </w:r>
           </w:p>
         </w:tc>
@@ -2237,7 +2237,7 @@
                 <w:sz w:val="16"/>
                 <w:szCs w:val="16"/>
               </w:rPr>
-              <w:t xml:space="preserve">Captações / ativos</w:t>
+              <w:t xml:space="preserve">Captações / ativo</w:t>
             </w:r>
           </w:p>
         </w:tc>
@@ -2422,7 +2422,7 @@
                 <w:sz w:val="16"/>
                 <w:szCs w:val="16"/>
               </w:rPr>
-              <w:t xml:space="preserve">Volatilidade do retorno</w:t>
+              <w:t xml:space="preserve">Volatilidade do ROA</w:t>
             </w:r>
           </w:p>
         </w:tc>
@@ -2780,7 +2780,7 @@
           <w:sz w:val="16"/>
           <w:szCs w:val="16"/>
         </w:rPr>
-        <w:t xml:space="preserve">Erros-padrão agrupados por instituição (HC3 nas duas últimas linhas); * p&lt;0,05, ** p&lt;0,01, *** p&lt;0,001, confirmados por bootstrap. Mediana (2): mediana condicional da coluna (2). Classificação: regra da seção 2.3. Fonte: elaboração dos autores com dados do IF.data.</w:t>
+        <w:t xml:space="preserve">Erros-padrão agrupados por instituição (HC3 nas duas últimas linhas); * p&lt;0,05, ** p&lt;0,01, *** p&lt;0,001, confirmados por bootstrap. Mediana (2): mediana condicional da especificação (2). Classificação: regra da seção 2.3. Fonte: elaboração dos autores com dados do IF.data.</w:t>
       </w:r>
     </w:p>
     <w:p>
@@ -2850,7 +2850,7 @@
           <w:sz w:val="18"/>
           <w:szCs w:val="18"/>
         </w:rPr>
-        <w:t xml:space="preserve">Todos os indicadores contra bancos, em desvios-padrão de cada indicador</w:t>
+        <w:t xml:space="preserve">Diferença entre cooperativas e bancos em cada indicador, em desvios-padrão</w:t>
       </w:r>
     </w:p>
     <w:p>
@@ -2864,7 +2864,7 @@
           <w:sz w:val="16"/>
           <w:szCs w:val="16"/>
         </w:rPr>
-        <w:t xml:space="preserve">Fonte: elaboração dos autores com dados do IF.data. Especificação com controle de porte e trimestre. Intervalos de 95% agrupados por instituição.</w:t>
+        <w:t xml:space="preserve">Fonte: elaboração dos autores com dados do IF.data. Especificação com controle de porte e trimestre. Intervalos de confiança de 95%, com erros-padrão agrupados por instituição.</w:t>
       </w:r>
     </w:p>
     <w:p>
@@ -2894,7 +2894,7 @@
         <w:jc w:val="both"/>
       </w:pPr>
       <w:r>
-        <w:t xml:space="preserve">O resultado sobre capital exige cuidado na leitura. Sem controles, a cooperativa mediana é mais capitalizada que o banco mediano, e a mediana das cooperativas fica acima da dos bancos na maior parte do período. Com controle de porte, porém, a diferença média é grande e negativa em todas as especificações. A Figura 3 concilia as duas leituras. O coeficiente da cooperativa é positivo na parte inferior da distribuição condicional do índice de Basileia e negativo na parte superior, e cruza zero perto do 40º percentil. Entre o 20º e o 80º percentil, a diferença média é cerca de um terço da diferença na média condicional.</w:t>
+        <w:t xml:space="preserve">O resultado relativo ao capital exige leitura cuidadosa. Sem controles, a cooperativa mediana apresenta índice de Basileia superior ao do banco mediano, e a mediana das cooperativas supera a dos bancos na maior parte do período. Quando se controla o porte, porém, a diferença de médias é grande e negativa em todas as especificações. A Figura 3 concilia as duas leituras. A diferença estimada é positiva na parte inferior da distribuição condicional do índice de Basileia e negativa na parte superior, com inversão de sinal próxima ao 40º percentil. Entre o 20º e o 80º percentil, a diferença média corresponde a cerca de um terço da estimada pela média condicional.</w:t>
       </w:r>
     </w:p>
     <w:p>
@@ -2904,7 +2904,7 @@
         <w:jc w:val="both"/>
       </w:pPr>
       <w:r>
-        <w:t xml:space="preserve">A média é puxada por uma cauda superior própria dos bancos. Sem controles, 14% dos trimestres bancários apresentam índice de Basileia acima de 50%, contra 1% dos trimestres das cooperativas. Essa cauda se concentra nos bancos que reportam individualmente, pequenos e com pouca exposição ponderada pelo risco. Exigir que o banco capte depósitos em todos os trimestres reduz à metade tanto a parcela de trimestres acima de 50% quanto a diferença média estimada. Em porte igual, o que separa os dois grupos é sobretudo a dispersão: descontados porte e trimestre, o desvio-padrão do índice de capital entre cooperativas é cerca de um terço do observado entre bancos. O mesmo padrão vale para os demais indicadores. As cooperativas formam o grupo mais homogêneo em todos eles, com dispersão residual entre um décimo e a metade da dos bancos.</w:t>
+        <w:t xml:space="preserve">A média é influenciada por uma cauda superior que só existe entre os bancos. Em 14% das observações trimestrais dos bancos, o índice de Basileia supera 50%; entre as cooperativas, essa proporção é de 1%. Essa cauda se concentra em bancos pequenos, que reportam de forma individual e têm baixa exposição ponderada pelo risco. Quando a comparação se restringe aos bancos que captaram depósitos em todos os trimestres, tanto a proporção de observações acima de 50% quanto a diferença média estimada caem à metade. Em porte igual, o que distingue os dois grupos é sobretudo a dispersão. Descontados os efeitos de porte e de trimestre, o desvio-padrão do índice de Basileia entre as cooperativas equivale a cerca de um terço do observado entre os bancos. O padrão se repete nos demais indicadores: as cooperativas formam o grupo mais homogêneo em todos eles, com dispersão residual entre um décimo e a metade da observada nos bancos.</w:t>
       </w:r>
     </w:p>
     <w:p>
@@ -2988,7 +2988,7 @@
           <w:sz w:val="16"/>
           <w:szCs w:val="16"/>
         </w:rPr>
-        <w:t xml:space="preserve">Fonte: elaboração dos autores com dados do IF.data. Painel (a): coeficientes de regressão quantílica com faixa de 95% por bootstrap de instituições, e a média condicional. Painel (b): índice antes da winsorização, em escala logarítmica; as alturas são percentuais dos trimestres de cada grupo.</w:t>
+        <w:t xml:space="preserve">Fonte: elaboração dos autores com dados do IF.data. Painel (a): coeficientes de regressão quantílica, com faixa de confiança de 95% obtida por bootstrap de instituições, e a média condicional. Painel (b): índice de Basileia antes do tratamento de valores extremos, em escala logarítmica; as alturas indicam o percentual das observações trimestrais de cada grupo.</w:t>
       </w:r>
     </w:p>
     <w:p>
@@ -3018,7 +3018,7 @@
         <w:jc w:val="both"/>
       </w:pPr>
       <w:r>
-        <w:t xml:space="preserve">Contra todas as não cooperativas, a cooperativa parece provisionar menos, com significância a 1% nas quatro especificações. Contra bancos, o coeficiente fica próximo de zero. A diferença do grupo amplo vem das instituições não bancárias que emprestam, cujos índices de provisão são quase três vezes os de bancos e cooperativas. Na mediana condicional o sinal se inverte, com a cooperativa provisionando mais. Como a preocupação da supervisão recai sobre o capital, a amostra foi dividida em tercis do índice de Basileia: nenhum tercil mostra a cooperativa provisionando menos. Como a provisão mínima é uma função da classificação de risco AA a H de cada operação, o resultado descreve sobretudo como cada grupo classifica sua carteira.</w:t>
+        <w:t xml:space="preserve">Em comparação com o conjunto de todas as instituições não cooperativas, as cooperativas parecem provisionar menos, com significância a 1% nas quatro especificações. Em comparação com os bancos, a diferença fica próxima de zero. A diferença observada no grupo amplo decorre das instituições não bancárias que concedem crédito, cujos índices de provisionamento são quase três vezes os de bancos e cooperativas. Na mediana condicional, o sinal se inverte: as cooperativas provisionam mais. Como a atenção da supervisão recai sobre o capital, a amostra foi dividida em tercis do índice de Basileia. Em nenhum deles as cooperativas provisionam menos que os bancos. Como a provisão mínima decorre da classificação de risco de cada operação, de AA a H, conforme a Resolução 2.682/1999, o resultado reflete sobretudo a forma como cada grupo classifica sua carteira.</w:t>
       </w:r>
     </w:p>
     <w:p>
@@ -3028,7 +3028,7 @@
         <w:jc w:val="both"/>
       </w:pPr>
       <w:r>
-        <w:t xml:space="preserve">A margem de intermediação segue o mesmo padrão. Contra o grupo amplo, ela é grande e significativa, porque as instituições não bancárias reportam margens várias vezes maiores que as de bancos e cooperativas em relação ao ativo. Contra bancos, é pequena e não significativa; contra bancos com depósitos, torna-se positiva. Como o sinal depende do grupo de comparação, o indicador é classificado como nulo. O índice de captações é significativo em uma das quatro especificações e inverte o sinal na mediana, e também não é reportado como resultado.</w:t>
+        <w:t xml:space="preserve">A margem de intermediação segue o mesmo padrão. No grupo amplo, a diferença é grande e significativa, porque as instituições não bancárias registram margens várias vezes superiores às de bancos e cooperativas em relação ao ativo. Em comparação com os bancos, a diferença é pequena e não significativa; em comparação com os bancos que captam depósitos, torna-se positiva. Como o sinal depende do grupo de comparação, o indicador é classificado como nulo. O índice de captações é significativo em apenas uma das quatro especificações e muda de sinal na mediana, razão pela qual também não é tratado como resultado.</w:t>
       </w:r>
     </w:p>
     <w:p>
@@ -3098,7 +3098,7 @@
           <w:sz w:val="18"/>
           <w:szCs w:val="18"/>
         </w:rPr>
-        <w:t xml:space="preserve">Quatro indicadores ao longo dos cinco grupos de comparação</w:t>
+        <w:t xml:space="preserve">Quatro indicadores nos cinco grupos de comparação</w:t>
       </w:r>
     </w:p>
     <w:p>
@@ -3112,7 +3112,7 @@
           <w:sz w:val="16"/>
           <w:szCs w:val="16"/>
         </w:rPr>
-        <w:t xml:space="preserve">Fonte: elaboração dos autores com dados do IF.data. Especificação com controles; o grupo "mesma região" pareia também por macrorregião. Intervalos de 95% agrupados por instituição. Marcadores cheios: p &lt; 0,05. Faixa sombreada: bancos, o grupo principal.</w:t>
+        <w:t xml:space="preserve">Fonte: elaboração dos autores com dados do IF.data. Especificação com controle de porte e trimestre; o grupo "mesma região" pareia também por macrorregião. Intervalos de confiança de 95%, com erros-padrão agrupados por instituição. Marcadores cheios: p &lt; 0,05. Faixa sombreada: bancos, o grupo principal.</w:t>
       </w:r>
     </w:p>
     <w:p>
@@ -3142,7 +3142,7 @@
         <w:jc w:val="both"/>
       </w:pPr>
       <w:r>
-        <w:t xml:space="preserve">Pareada apenas por porte, a cooperativa destina ao crédito parcela substancialmente maior do ativo que o banco comparável, com significância a 1% em todas as especificações. Pareada também por macrorregião, a diferença é pequena e não se distingue de zero. As cooperativas emprestam mais que o conjunto nacional de bancos; dentro dos mercados regionais, a diferença não pode ser separada de zero. Qual das duas estimativas é a relevante depende de uma hipótese que os dados não testam. Se a cooperativa se concentra onde está por razões internas ao modelo de finanças associativas, a região é um mediador e vale a estimativa nacional. Se a estrutura do mercado regional é alheia à forma organizacional, a região é um fator de confusão e o resultado é nulo. O estudo reporta as duas como parâmetros distintos. As estimativas regionais são imprecisas, porque o pareamento exato por região deixa um conjunto de controle efetivo de cerca de dezoito instituições.</w:t>
+        <w:t xml:space="preserve">Quando o pareamento considera apenas o porte, as cooperativas destinam ao crédito parcela do ativo substancialmente maior que a dos bancos comparáveis, com significância a 1% em todas as especificações. Quando o pareamento inclui também a macrorregião, a diferença é pequena e não se distingue de zero. As cooperativas emprestam mais que o conjunto dos bancos do país; dentro de cada mercado regional, a diferença não pode ser separada de zero. Qual das duas estimativas é a relevante depende de uma hipótese que os dados não permitem testar. Se a cooperativa se concentra onde está por razões internas ao modelo de finanças associativas, a região é um mediador e vale a estimativa nacional. Se a estrutura do mercado regional independe da forma organizacional, a região é um fator de confusão e o resultado é nulo. O estudo apresenta as duas estimativas como parâmetros distintos. As estimativas regionais são imprecisas, porque o pareamento exato por região reduz o grupo de controle efetivo a cerca de dezoito instituições.</w:t>
       </w:r>
     </w:p>
     <w:p>
@@ -3162,7 +3162,7 @@
           <w:sz w:val="24"/>
           <w:szCs w:val="24"/>
         </w:rPr>
-        <w:t xml:space="preserve">3.5 Redes</w:t>
+        <w:t xml:space="preserve">3.5 Sistemas cooperativos</w:t>
       </w:r>
     </w:p>
     <w:p>
@@ -3172,7 +3172,7 @@
         <w:jc w:val="both"/>
       </w:pPr>
       <w:r>
-        <w:t xml:space="preserve">Sicredi e Sicoob respondem por todas as cooperativas da amostra, exceto sete. As cooperativas das duas redes mantêm menos capital regulatório que bancos comparáveis, com significância confirmada pelo bootstrap em cada uma. As seis independentes se apoiam em cinco grupos tratados, e sua estimativa de capital é positiva e indistinguível de ruído. A divisão localiza a diferença de capital nas duas grandes redes sem explicá-la. Um mecanismo de proteção da rede é uma explicação candidata: uma cooperativa com liquidez centralizada e gestão consolidada de risco atrás de si pode operar com um colchão individual mais fino. As redes também diferem em porte, geografia, mix de negócios e governança das filiadas, e a divisão não separa a proteção desses fatores. A provisão é não significativa em todos os sistemas.</w:t>
+        <w:t xml:space="preserve">Sicredi e Sicoob reúnem todas as cooperativas da amostra, com exceção de sete. As filiadas aos dois sistemas mantêm índice de Basileia inferior ao de bancos comparáveis, com significância confirmada pelo bootstrap em cada um deles. As seis cooperativas independentes correspondem a apenas cinco grupos tratados, e a diferença de capital estimada para elas é positiva e não se distingue de ruído estatístico. A divisão por sistema localiza a diferença de capital nos dois grandes sistemas, mas não a explica. Uma explicação possível é o suporte do sistema: uma cooperativa que conta com centralização financeira e gestão consolidada de riscos pode operar com um colchão individual mais fino. Os sistemas também diferem quanto ao porte, à distribuição geográfica, ao perfil de negócios e à governança das filiadas, e a análise não separa o efeito do suporte desses fatores. A diferença de provisionamento não é significativa em nenhum dos sistemas.</w:t>
       </w:r>
     </w:p>
     <w:p>
@@ -3206,7 +3206,7 @@
         <w:jc w:val="both"/>
       </w:pPr>
       <w:r>
-        <w:t xml:space="preserve">Excluir os onze bancos de S1 e S2 altera nenhum coeficiente significativo em mais de 2%.</w:t>
+        <w:t xml:space="preserve">A exclusão dos onze bancos dos segmentos S1 e S2 não altera nenhum coeficiente significativo em mais de 2%.</w:t>
       </w:r>
     </w:p>
     <w:p>
@@ -3234,7 +3234,7 @@
         <w:jc w:val="both"/>
       </w:pPr>
       <w:r>
-        <w:t xml:space="preserve">Quatro regras de winsorização, a reestimação apenas nas linhas com provisão observada e a exclusão das seis cooperativas que retornaram à metodologia simplificada deixam todos os sinais inalterados.</w:t>
+        <w:t xml:space="preserve">Quatro regras de tratamento de valores extremos, a reestimação apenas com as observações em que a provisão é informada e a exclusão das seis cooperativas que voltaram à metodologia simplificada mantêm todos os sinais.</w:t>
       </w:r>
     </w:p>
     <w:p>
@@ -3248,7 +3248,7 @@
         <w:jc w:val="both"/>
       </w:pPr>
       <w:r>
-        <w:t xml:space="preserve">As estimativas pareadas, ponderadas e não ponderadas, diferem menos que o erro amostral.</w:t>
+        <w:t xml:space="preserve">As estimativas na amostra pareada, com e sem ponderação, diferem entre si menos que o erro amostral.</w:t>
       </w:r>
     </w:p>
     <w:p>
@@ -3262,7 +3262,7 @@
         <w:jc w:val="both"/>
       </w:pPr>
       <w:r>
-        <w:t xml:space="preserve">As cooperativas que adotam a metodologia completa durante o período eram, antes da adoção, menos intensivas em crédito e marginalmente menos lucrativas que as que nunca adotam. A seleção para a amostra tende a reduzir, e não a inflar, as diferenças de crédito e rentabilidade.</w:t>
+        <w:t xml:space="preserve">As cooperativas que passaram à metodologia completa durante o período tinham, antes da mudança, menor participação do crédito no ativo e rentabilidade um pouco menor que as que permaneceram na simplificada. A seleção para a amostra tende, portanto, a subestimar as diferenças de crédito e de rentabilidade.</w:t>
       </w:r>
     </w:p>
     <w:p>
@@ -3313,7 +3313,7 @@
         <w:jc w:val="both"/>
       </w:pPr>
       <w:r>
-        <w:t xml:space="preserve">Os resultados tocam dois eixos de proporcionalidade além do porte. O primeiro é a arquitetura organizacional. A diferença de capital é uma propriedade das duas grandes redes. Se a hipótese da proteção de rede estiver correta, um arcabouço proporcional pode tratar a rede integrada e seu mecanismo de proteção como a unidade relevante para parte da avaliação de capital e liquidez. Os grupos cooperativos franceses já são tratados assim. Se a diferença refletir porte, geografia ou mix das filiadas, a sugestão não se sustenta. O segundo eixo é a calibragem do benchmark. Um referencial definido pela instituição média da metodologia completa pode descrever mal a configuração cooperativa, porque essa média vem de uma distribuição cuja região superior as cooperativas não ocupam.</w:t>
+        <w:t xml:space="preserve">Os resultados alcançam duas dimensões da proporcionalidade além do porte. A primeira é a arquitetura organizacional, já que a diferença de capital é um traço dos dois grandes sistemas. Se a hipótese do suporte do sistema se confirmar, um arcabouço proporcional pode tratar o sistema cooperativo e seus mecanismos de proteção como a unidade de referência para parte da avaliação de capital e de liquidez, como já ocorre com os grupos cooperativos franceses. Se a diferença refletir o porte, a distribuição geográfica ou o perfil de negócios das filiadas, essa sugestão perde fundamento. A segunda dimensão é a calibragem do referencial. Um parâmetro definido pela instituição média da metodologia completa pode descrever mal a configuração das cooperativas, porque essa média provém de uma distribuição cuja parte superior as cooperativas não ocupam.</w:t>
       </w:r>
     </w:p>
     <w:p>
@@ -3323,7 +3323,7 @@
         <w:jc w:val="both"/>
       </w:pPr>
       <w:r>
-        <w:t xml:space="preserve">Um requerimento mais leve não decorre automaticamente desses achados. O argumento de que o supervisor age em nome de depositantes dispersos perde força para uma cooperativa de propriedade dos associados e monitorada pela rede. A externalidade sistêmica da quebra e o risco moral da garantia pública continuam a valer. Capital mais fino pode pedir atenção supervisória mais próxima, e não apenas alívio.</w:t>
+        <w:t xml:space="preserve">Um requerimento mais brando não decorre automaticamente desses resultados. O argumento de que o supervisor atua em nome de depositantes dispersos perde força no caso de uma cooperativa de propriedade dos associados e acompanhada pela central. O risco sistêmico de uma quebra e o risco moral associado à garantia pública de depósitos permanecem. Um capital mais fino pode justificar tanto acompanhamento supervisório mais próximo quanto alívio de exigências.</w:t>
       </w:r>
     </w:p>
     <w:p>
@@ -3353,7 +3353,7 @@
         <w:jc w:val="both"/>
       </w:pPr>
       <w:r>
-        <w:t xml:space="preserve">A combinação relevante é capital e provisão lidos em conjunto. Na ponta fina da distribuição de capital, onde a preocupação prudencial se concentra, a cooperativa mantém mais capital que o banco comparável e provisiona igual ou mais. O dado que sustenta a leitura de "cooperativa menos capitalizada" é a ausência, entre cooperativas, da cauda de bancos muito capitalizados. Várias diferenças que parecem grandes na média são diferenças de dispersão, e a mediana condicional e o perfil por quantil merecem o mesmo peso que a média.</w:t>
+        <w:t xml:space="preserve">Para a supervisão, a leitura relevante combina capital e provisão. Na faixa inferior da distribuição de capital, onde se concentra a preocupação prudencial, as cooperativas mantêm mais capital que os bancos comparáveis e provisionam em nível igual ou superior. O dado que sustenta a leitura de que a cooperativa é menos capitalizada é a ausência, entre elas, da cauda de bancos com capital muito elevado. Várias diferenças que parecem grandes na média são, na verdade, diferenças de dispersão; a mediana condicional e o perfil por quantil merecem o mesmo peso que a média na análise.</w:t>
       </w:r>
     </w:p>
     <w:p>
@@ -3383,7 +3383,7 @@
         <w:jc w:val="both"/>
       </w:pPr>
       <w:r>
-        <w:t xml:space="preserve">A diferença entre as duas formas persiste sob uma metodologia prudencial comum, em versão mais estreita do que uma comparação frouxa sugere. O posicionamento institucional ganha em precisão se apoiado nos resultados que resistiram a todas as definições de banco testadas: custo menor na mediana, retorno sobre ativos maior e retorno mais estável. O argumento de provisionamento mais conservador que o dos bancos não encontra apoio nos dados. O argumento de maior intensidade de crédito vale contra o conjunto nacional de bancos e ainda não foi demonstrado dentro dos mercados regionais.</w:t>
+        <w:t xml:space="preserve">As diferenças entre as duas formas de organização persistem sob a metodologia prudencial comum, ainda que em versão mais restrita do que sugere uma comparação menos criteriosa. O posicionamento institucional ganha precisão quando se apoia nos resultados que resistiram a todas as definições de banco testadas: menor custo na mediana, maior retorno sobre o ativo e retorno mais estável. O argumento de que as cooperativas provisionam de forma mais conservadora que os bancos não encontra apoio nos dados. O argumento da maior participação do crédito no ativo vale em relação ao conjunto dos bancos do país, mas ainda não foi demonstrado dentro dos mercados regionais.</w:t>
       </w:r>
     </w:p>
     <w:p>
@@ -3393,7 +3393,7 @@
         <w:jc w:val="both"/>
       </w:pPr>
       <w:r>
-        <w:t xml:space="preserve">Três escolhas de análise decidiram se os resultados de manchete existiam: o grupo de comparação, a leitura das contas de resultado como fluxos trimestrais e a estimação não ponderada na amostra pareada. Cada uma é uma leitura natural do material de origem, e parte das divergências na literatura pode refletir grupos de comparação distintos.</w:t>
+        <w:t xml:space="preserve">Três decisões de análise determinaram a existência ou não dos resultados de destaque: a escolha do grupo de comparação, a leitura das contas de resultado como fluxos trimestrais e a estimação sem ponderação na amostra pareada. Cada uma delas é uma leitura natural dos dados originais, e parte das divergências encontradas na literatura pode refletir grupos de comparação distintos.</w:t>
       </w:r>
     </w:p>
     <w:p>
@@ -3428,7 +3428,7 @@
         <w:jc w:val="both"/>
       </w:pPr>
       <w:r>
-        <w:t xml:space="preserve">Como a condição de cooperativa não varia no tempo, as estimativas são correlações condicionais, não efeitos causais da forma organizacional.</w:t>
+        <w:t xml:space="preserve">Como a condição de cooperativa não varia no tempo, as estimativas são correlações condicionais e não devem ser lidas como efeitos causais da forma organizacional.</w:t>
       </w:r>
     </w:p>
     <w:p>
@@ -3442,7 +3442,7 @@
         <w:jc w:val="both"/>
       </w:pPr>
       <w:r>
-        <w:t xml:space="preserve">A restrição à metodologia completa seleciona as maiores cooperativas, cerca de um décimo das registradas no painel, e os resultados valem para essa subpopulação.</w:t>
+        <w:t xml:space="preserve">A restrição à metodologia completa seleciona as maiores cooperativas, cerca de um décimo das registradas no painel, e os resultados se aplicam a essa subpopulação.</w:t>
       </w:r>
     </w:p>
     <w:p>
@@ -3456,7 +3456,7 @@
         <w:jc w:val="both"/>
       </w:pPr>
       <w:r>
-        <w:t xml:space="preserve">O índice de provisão é uma variável contábil e não mede inadimplência.</w:t>
+        <w:t xml:space="preserve">O índice de provisionamento é uma variável contábil e não mede a inadimplência efetiva.</w:t>
       </w:r>
     </w:p>
     <w:p>
@@ -3470,7 +3470,7 @@
         <w:jc w:val="both"/>
       </w:pPr>
       <w:r>
-        <w:t xml:space="preserve">Os indicadores de estabilidade são estatísticas por instituição, estimadas sem efeitos de trimestre, em uma subamostra com ao menos oito trimestres.</w:t>
+        <w:t xml:space="preserve">Os indicadores de estabilidade são estatísticas calculadas por instituição, sem controle por trimestre, em uma subamostra com pelo menos oito trimestres de dados.</w:t>
       </w:r>
     </w:p>
     <w:p>
@@ -3484,7 +3484,7 @@
         <w:jc w:val="both"/>
       </w:pPr>
       <w:r>
-        <w:t xml:space="preserve">A maioria dos sistemas é pouco representada para inferência separada, e a hipótese da proteção de rede exige dados consolidados que o IF.data não traz.</w:t>
+        <w:t xml:space="preserve">A maioria dos sistemas tem poucas cooperativas na amostra para inferência separada, e a hipótese do suporte do sistema exige dados consolidados que o IF.data não contém.</w:t>
       </w:r>
     </w:p>
     <w:p>
@@ -3498,7 +3498,7 @@
         <w:jc w:val="both"/>
       </w:pPr>
       <w:r>
-        <w:t xml:space="preserve">A macrorregião é uma medida grosseira de mercado; a distinção relevante é provavelmente o crédito rural.</w:t>
+        <w:t xml:space="preserve">A macrorregião é uma aproximação grosseira do mercado relevante; a distinção provavelmente mais importante é a do crédito rural.</w:t>
       </w:r>
     </w:p>
     <w:p>
@@ -3533,7 +3533,7 @@
         <w:jc w:val="both"/>
       </w:pPr>
       <w:r>
-        <w:t xml:space="preserve">Levar ao Banco Central a discussão sobre o tratamento das redes integradas e de seus mecanismos de proteção na avaliação de capital e liquidez, com a experiência francesa como referência.</w:t>
+        <w:t xml:space="preserve">Levar ao Banco Central a discussão sobre o tratamento dos sistemas cooperativos e de seus mecanismos de proteção na avaliação de capital e de liquidez, tendo a experiência francesa como referência.</w:t>
       </w:r>
     </w:p>
     <w:p>
@@ -3575,7 +3575,7 @@
         <w:jc w:val="both"/>
       </w:pPr>
       <w:r>
-        <w:t xml:space="preserve">Estender a análise com os módulos de modalidade de crédito do IF.data, para testar a diferença de intensidade de crédito dentro dos mercados regionais.</w:t>
+        <w:t xml:space="preserve">Ampliar a análise com os relatórios de carteira de crédito por modalidade do IF.data, para testar a diferença de participação do crédito dentro dos mercados regionais.</w:t>
       </w:r>
     </w:p>
     <w:p>
@@ -3589,7 +3589,7 @@
         <w:jc w:val="both"/>
       </w:pPr>
       <w:r>
-        <w:t xml:space="preserve">Reunir dados consolidados das redes para testar a hipótese da proteção de rede.</w:t>
+        <w:t xml:space="preserve">Reunir dados consolidados dos sistemas cooperativos para testar a hipótese do suporte do sistema.</w:t>
       </w:r>
     </w:p>
     <w:p>
@@ -3603,7 +3603,7 @@
         <w:jc w:val="both"/>
       </w:pPr>
       <w:r>
-        <w:t xml:space="preserve">Atualizar o estudo anualmente com o pipeline público de reprodução e acompanhar os efeitos da revisão das regras de capital de 2022 e da Resolução 4.966/2021.</w:t>
+        <w:t xml:space="preserve">Atualizar o estudo anualmente, com a rotina pública de reprodução, e acompanhar os efeitos da revisão das regras de capital de 2022 e da Resolução CMN 4.966/2021.</w:t>
       </w:r>
     </w:p>
     <w:p>
@@ -3634,7 +3634,7 @@
         <w:jc w:val="both"/>
       </w:pPr>
       <w:r>
-        <w:t xml:space="preserve">Os resultados vêm de um único conjunto de scripts executado sobre os arquivos públicos do IF.data, com cada grupo de comparação, esquema de coarsening, regra de winsorização e teste de sensibilidade tratado como parâmetro. As tabelas e figuras são geradas a partir dos arquivos de resultado, sem transcrição manual. A reprodução completa do pipeline a partir de um diretório vazio devolve todos os arquivos de resultado, tabelas e figuras byte a byte.</w:t>
+        <w:t xml:space="preserve">Os resultados provêm de um único conjunto de rotinas executado sobre os arquivos públicos do IF.data, em que cada grupo de comparação, faixa de pareamento, regra de tratamento de valores extremos e teste de sensibilidade é um parâmetro. As tabelas e figuras são geradas diretamente dos arquivos de resultado, sem transcrição manual. A reexecução completa das rotinas a partir de um diretório vazio reproduz todos os arquivos de resultado, tabelas e figuras de forma idêntica.</w:t>
       </w:r>
     </w:p>
     <w:p>
@@ -3644,7 +3644,7 @@
         <w:jc w:val="both"/>
       </w:pPr>
       <w:r>
-        <w:t xml:space="preserve">O estimador de pareamento pondera as unidades de controle para que a razão entre tratados e controles seja igual em cada estrato; a regressão simples na amostra pareada não recupera esse estimando, e os dois são reportados. A inferência usa erros-padrão agrupados por instituição e um bootstrap selvagem restrito com pesos de Rademacher, porque o teste agrupado rejeita uma hipótese nula verdadeira em 16% das simulações com seis grupos tratados, contra o nível nominal de 5%. Os indicadores de estabilidade são estimados com uma linha por instituição, com a média do logaritmo do ativo como controle de porte.</w:t>
+        <w:t xml:space="preserve">O estimador de pareamento pondera as unidades de controle de modo que a razão entre tratados e controles seja a mesma em cada estrato. A regressão simples na amostra pareada não recupera esse estimando, e por isso os dois são apresentados. A inferência utiliza erros-padrão agrupados por instituição e um bootstrap selvagem restrito com pesos de Rademacher. Em simulações com seis grupos tratados, o teste agrupado convencional rejeita uma hipótese nula verdadeira em 16% dos casos, contra o nível nominal de 5%. Os indicadores de estabilidade são estimados com uma observação por instituição, tendo a média do logaritmo do ativo como controle de porte.</w:t>
       </w:r>
     </w:p>
     <w:p>

</xml_diff>